<commit_message>
Updated config file to load best parameters from tune if they exist
</commit_message>
<xml_diff>
--- a/TFT_Sector_Rotation_Paper_with_Appendix.docx
+++ b/TFT_Sector_Rotation_Paper_with_Appendix.docx
@@ -8,7 +8,7 @@
         <w:jc w:val="center"/>
       </w:pPr>
       <w:r>
-        <w:t>A Temporal Transfusion Transformer (TFT) Approach to Sector Rotation</w:t>
+        <w:t>A Temporal Fusion Transformer (TFT) Approach to Sector Rotation</w:t>
       </w:r>
     </w:p>
     <w:p>
@@ -21,7 +21,7 @@
     </w:p>
     <w:p>
       <w:r>
-        <w:t>This paper presents a robust framework for weekly sector rotation using a Temporal Transfusion Transformer (TFT). Unlike standard forecasting models that predict absolute price, this architecture is optimized to predict relative returns (Sector - SPY) to isolate idiosyncratic sector strength from broad market movements. We implement a walk-forward validation schema and a multi-seed ensembling approach to mitigate the high variance inherent in financial time-series data.</w:t>
+        <w:t>This paper presents a robust framework for weekly sector rotation using a Temporal Fusion Transformer (TFT). Unlike standard forecasting models that predict absolute price, this architecture is optimized to predict relative returns (Sector - SPY) to isolate idiosyncratic sector strength from broad market movements. We implement a walk-forward validation schema and a multi-seed ensembling approach to mitigate the high variance inherent in financial time-series data.</w:t>
       </w:r>
     </w:p>
     <w:p>
@@ -157,7 +157,90 @@
         <w:pStyle w:val="Heading1"/>
       </w:pPr>
       <w:r>
-        <w:t>IV. Real-World Friction &amp; Option Modeling</w:t>
+        <w:t>IV. The Sharpe Ratio: Quantifying Risk-Adjusted Performance</w:t>
+      </w:r>
+    </w:p>
+    <w:p>
+      <w:r>
+        <w:t>For a market-neutral sector rotation strategy, the Sharpe ratio serves as the primary performance metric. It measures the magnitude of excess returns relative to their volatility, which is the relevant question for a strategy designed to generate steady, uncorrelated alpha rather than to amplify market beta.</w:t>
+      </w:r>
+    </w:p>
+    <w:p>
+      <w:pPr>
+        <w:pStyle w:val="ListBullet"/>
+      </w:pPr>
+      <w:r>
+        <w:rPr>
+          <w:b/>
+        </w:rPr>
+        <w:t xml:space="preserve">Mathematical Form: </w:t>
+      </w:r>
+      <w:r>
+        <w:t>Sharpe = (mean return − risk-free rate) / standard deviation of returns. For weekly returns, the value is annualized by multiplication by √52, giving comparability with strategies operating at other frequencies.</w:t>
+      </w:r>
+    </w:p>
+    <w:p>
+      <w:pPr>
+        <w:pStyle w:val="ListBullet"/>
+      </w:pPr>
+      <w:r>
+        <w:rPr>
+          <w:b/>
+        </w:rPr>
+        <w:t xml:space="preserve">Why It Suits This Project: </w:t>
+      </w:r>
+      <w:r>
+        <w:t>Because the long/short construction removes broad-market exposure, the strategy is expected to produce a modest but persistent return stream. The Sharpe ratio rewards exactly this profile—consistency over magnitude—and is the metric institutional allocators expect to see for any market-neutral strategy.</w:t>
+      </w:r>
+    </w:p>
+    <w:p>
+      <w:pPr>
+        <w:pStyle w:val="ListBullet"/>
+      </w:pPr>
+      <w:r>
+        <w:rPr>
+          <w:b/>
+        </w:rPr>
+        <w:t xml:space="preserve">Interpretation Bands: </w:t>
+      </w:r>
+      <w:r>
+        <w:t>Sharpe below 0.5 is typically considered weak or indistinguishable from noise; 0.5 to 1.0 reflects the historical range of major equity risk factors after costs; 1.0 to 2.0 covers most successful systematic equity strategies; values sustained above 3.0 on meaningful capital are vanishingly rare and warrant skepticism.</w:t>
+      </w:r>
+    </w:p>
+    <w:p>
+      <w:pPr>
+        <w:pStyle w:val="ListBullet"/>
+      </w:pPr>
+      <w:r>
+        <w:rPr>
+          <w:b/>
+        </w:rPr>
+        <w:t xml:space="preserve">Single-Seed vs. Ensemble Reporting: </w:t>
+      </w:r>
+      <w:r>
+        <w:t>A single-seed walk-forward Sharpe is biased upward as an estimator of expected out-of-sample performance, since selecting the best result among multiple random initializations does not generalize to future runs. The ensemble mean across multiple seeds provides the more honest expected value, while the standard deviation across seeds quantifies the uncertainty around that estimate.</w:t>
+      </w:r>
+    </w:p>
+    <w:p>
+      <w:pPr>
+        <w:pStyle w:val="ListBullet"/>
+      </w:pPr>
+      <w:r>
+        <w:rPr>
+          <w:b/>
+        </w:rPr>
+        <w:t xml:space="preserve">Limitations: </w:t>
+      </w:r>
+      <w:r>
+        <w:t>The Sharpe ratio assumes returns are approximately normally distributed and penalizes upside volatility identically to downside volatility. The Sortino ratio addresses the latter concern by penalizing only downside variance. Despite these limitations, the Sharpe ratio remains the de facto standard in quantitative finance for risk-adjusted performance evaluation, and is reported alongside cumulative return and maximum drawdown in any rigorous strategy evaluation.</w:t>
+      </w:r>
+    </w:p>
+    <w:p>
+      <w:pPr>
+        <w:pStyle w:val="Heading1"/>
+      </w:pPr>
+      <w:r>
+        <w:t>V. Real-World Friction &amp; Option Modeling</w:t>
       </w:r>
     </w:p>
     <w:p>
@@ -198,12 +281,12 @@
         <w:pStyle w:val="Heading1"/>
       </w:pPr>
       <w:r>
-        <w:t>V. Conclusion</w:t>
+        <w:t>VI. Conclusion</w:t>
       </w:r>
     </w:p>
     <w:p>
       <w:r>
-        <w:t>The Temporal Transfusion Transformer provides a resilient signal for sector rotation by focusing on cross-sectional ranking and utilizing an interpretable architecture. Future research will focus on incorporating alternative data sets.</w:t>
+        <w:t>The Temporal Fusion Transformer provides a resilient signal for sector rotation by focusing on cross-sectional ranking and utilizing an interpretable architecture. Future research will focus on incorporating alternative data sets.</w:t>
       </w:r>
     </w:p>
     <w:p>

</xml_diff>